<commit_message>
feat(meta-dnam): internal peer reviews, validity audit, applied revisions
</commit_message>
<xml_diff>
--- a/anti_ageing_review/meta_dnam_clocks/submission_assets/IJMR_DNAm_clocks_path_c_2026-05-18/IJMR_DNAm_clocks_manuscript_2026-05-18.docx
+++ b/anti_ageing_review/meta_dnam_clocks/submission_assets/IJMR_DNAm_clocks_path_c_2026-05-18/IJMR_DNAm_clocks_manuscript_2026-05-18.docx
@@ -63,7 +63,7 @@
     <w:p/>
     <w:p>
       <w:r>
-        <w:t>**Conclusions.** Current trial reporting does not yet support a confident pooled estimate of intervention effects on DNAm clocks. We call for standardized arm-level mean ± SD reporting of clock values in trial publications.</w:t>
+        <w:t>**Conclusions.** Current trial reporting does not yet support a confident pooled estimate of intervention effects on DNAm clocks; although the central pooled estimate is null, the 95% prediction interval is wide enough that no directional clinical decision should be made on these data. DNAm-clock outcomes should be treated as exploratory pharmacodynamic markers, not decision-grade endpoints, pending pre-specified powered harmonised trials. We call for standardized arm-level mean ± SD reporting of clock values in trial publications.</w:t>
       </w:r>
     </w:p>
     <w:p/>
@@ -271,7 +271,7 @@
     <w:p/>
     <w:p>
       <w:r>
-        <w:t>Per-clock random-effects pooling used DerSimonian–Laird (DL) generic inverse-variance with τ² from the Method-of-Moments estimator. We additionally report Hartung–Knapp–Sidik–Jonkman (HKSJ) confidence intervals and a Bayesian normal-normal hierarchical pool with a half-normal(0, 0.5) prior on τ (20 000 MH iterations, 5 000 burn-in, random seed 42), all cross-checked in R using `meta::metagen` + `bayesmeta::bayesmeta`. Agreement is recorded per pool. The 95% prediction interval (Higgins, Thompson, Spiegelhalter 2009) is computed when k ≥ 3.</w:t>
+        <w:t>Per-clock random-effects pooling used DerSimonian–Laird (DL) generic inverse-variance with τ² from the Method-of-Moments estimator. Because the eligible adjusted effects use different adjustment sets (e.g., difference-in-difference β, ANCOVA-adjusted between-arm mean difference, covariance-adjusted regression β), the resulting pooled estimate is interpreted descriptively — as a summary of three heterogeneous adjusted contrasts — rather than as an estimate of a single common causal effect. We additionally report Hartung–Knapp–Sidik–Jonkman (HKSJ) confidence intervals and a Bayesian normal-normal hierarchical pool with a half-normal(0, 0.5) prior on τ (20 000 MH iterations, 5 000 burn-in, random seed 42), all cross-checked in R using `meta::metagen` + `bayesmeta::bayesmeta`. Agreement is recorded per pool. The 95% prediction interval (Higgins, Thompson, Spiegelhalter 2009) is computed when k ≥ 3.</w:t>
       </w:r>
     </w:p>
     <w:p/>
@@ -341,7 +341,7 @@
     <w:p/>
     <w:p>
       <w:r>
-        <w:t>The search layer produced 2804 raw records across five sources. After deduplication and title/abstract screening, 21 reports were included in the qualitative synthesis (PRISMA 2020 flow, Figure 1). Path-C relaxed eligibility (A2/A3) promoted 11 previously-excluded reports back into the qualitative synthesis on the basis of longitudinal arm-level clock reporting and adjusted-effect availability.</w:t>
+        <w:t>The search layer produced 2804 raw records across five sources. After deduplication and title/abstract screening, 21 reports were included in the qualitative synthesis (PRISMA 2020 flow, Figure 1). Path-C relaxed eligibility (A2/A3) promoted 11 previously-excluded reports back into the qualitative synthesis on the basis of longitudinal arm-level clock reporting and adjusted-effect availability. The binding constraint on this review was extraction yield, not search yield: of the 21 qualitatively-eligible reports, only k=3 contributed adjusted between-group DunedinPACE effects with extractable SE/CI on the original clock scale, and no other clock crossed the k≥3 pooling gate.</w:t>
       </w:r>
     </w:p>
     <w:p/>

</xml_diff>